<commit_message>
CV SIRH : retrait de WallOfTraders.com et SEO ; ajout CV Chef de projet SIRH/AMOA (FR, EN) et CV Project Manager EN
Co-Authored-By: Claude Sonnet 5.5 <noreply@anthropic.com>
</commit_message>
<xml_diff>
--- a/Resume_GaetanFRANCOIS_SIRH.docx
+++ b/Resume_GaetanFRANCOIS_SIRH.docx
@@ -296,7 +296,7 @@
                 <w:color w:val="DDDDDD"/>
                 <w:sz w:val="17"/>
               </w:rPr>
-              <w:t>HTML5, CSS3, SQL, SEO</w:t>
+              <w:t>HTML5, CSS3, SQL</w:t>
             </w:r>
           </w:p>
           <w:p>
@@ -653,7 +653,7 @@
                 <w:color w:val="333333"/>
                 <w:sz w:val="19"/>
               </w:rPr>
-              <w:t>Consultant SIRH freelance avec 15 ans d'expérience en déploiement, TMA et migration de solutions SAP HR sur des environnements enterprise multi-pays. Compétences fonctionnelles et techniques sur SAP HR/HCM et SuccessFactors Employee Central, avec un fort ancrage sur le compte L'Oréal mondial (40+ pays). Product Manager d'une startup SaaS B2B/B2C. Utilise Claude Code et l'IA générative au quotidien.</w:t>
+              <w:t>Consultant SIRH freelance avec 15 ans d'expérience en déploiement, TMA et migration de solutions SAP HR sur des environnements enterprise multi-pays. Compétences fonctionnelles et techniques sur SAP HR/HCM et SuccessFactors Employee Central, avec un fort ancrage sur le compte L'Oréal mondial (40+ pays). Utilise Claude Code et l'IA générative au quotidien.</w:t>
             </w:r>
           </w:p>
           <w:p>
@@ -878,177 +878,6 @@
               <w:spacing w:after="80"/>
             </w:pPr>
           </w:p>
-          <w:tbl>
-            <w:tblPr>
-              <w:tblW w:type="auto" w:w="0"/>
-              <w:tblLayout w:type="fixed"/>
-              <w:tblLook w:firstColumn="1" w:firstRow="1" w:lastColumn="0" w:lastRow="0" w:noHBand="0" w:noVBand="1" w:val="04A0"/>
-              <w:tblBorders>
-                <w:top w:val="nil"/>
-                <w:left w:val="nil"/>
-                <w:bottom w:val="nil"/>
-                <w:right w:val="nil"/>
-                <w:insideH w:val="nil"/>
-                <w:insideV w:val="nil"/>
-              </w:tblBorders>
-            </w:tblPr>
-            <w:tblGrid>
-              <w:gridCol w:w="2041"/>
-              <w:gridCol w:w="5556"/>
-            </w:tblGrid>
-            <w:tr>
-              <w:tc>
-                <w:tcPr>
-                  <w:tcW w:type="dxa" w:w="2041"/>
-                  <w:tcMar>
-                    <w:top w:w="0" w:type="dxa"/>
-                    <w:bottom w:w="0" w:type="dxa"/>
-                    <w:start w:w="0" w:type="dxa"/>
-                    <w:end w:w="150" w:type="dxa"/>
-                  </w:tcMar>
-                  <w:vAlign w:val="top"/>
-                </w:tcPr>
-                <w:p>
-                  <w:pPr>
-                    <w:spacing w:after="20" w:before="0"/>
-                  </w:pPr>
-                  <w:r>
-                    <w:rPr>
-                      <w:rFonts w:ascii="Arial" w:hAnsi="Arial"/>
-                      <w:b/>
-                      <w:i w:val="0"/>
-                      <w:color w:val="1C2B3A"/>
-                      <w:sz w:val="17"/>
-                    </w:rPr>
-                    <w:t>2018 - 2026</w:t>
-                  </w:r>
-                </w:p>
-                <w:p>
-                  <w:pPr>
-                    <w:spacing w:after="20" w:before="0"/>
-                  </w:pPr>
-                  <w:r>
-                    <w:rPr>
-                      <w:rFonts w:ascii="Arial" w:hAnsi="Arial"/>
-                      <w:b w:val="0"/>
-                      <w:i w:val="0"/>
-                      <w:color w:val="444444"/>
-                      <w:sz w:val="17"/>
-                    </w:rPr>
-                    <w:t>WallOfTraders.com</w:t>
-                  </w:r>
-                </w:p>
-                <w:p>
-                  <w:pPr>
-                    <w:spacing w:after="0" w:before="0"/>
-                  </w:pPr>
-                  <w:r>
-                    <w:rPr>
-                      <w:rFonts w:ascii="Arial" w:hAnsi="Arial"/>
-                      <w:b w:val="0"/>
-                      <w:i w:val="0"/>
-                      <w:color w:val="777777"/>
-                      <w:sz w:val="16"/>
-                    </w:rPr>
-                    <w:t>Remote</w:t>
-                  </w:r>
-                </w:p>
-              </w:tc>
-              <w:tc>
-                <w:tcPr>
-                  <w:tcW w:type="dxa" w:w="5556"/>
-                  <w:tcMar>
-                    <w:top w:w="0" w:type="dxa"/>
-                    <w:bottom w:w="0" w:type="dxa"/>
-                    <w:start w:w="0" w:type="dxa"/>
-                    <w:end w:w="0" w:type="dxa"/>
-                  </w:tcMar>
-                  <w:vAlign w:val="top"/>
-                </w:tcPr>
-                <w:p>
-                  <w:pPr>
-                    <w:spacing w:after="60" w:before="0"/>
-                  </w:pPr>
-                  <w:r>
-                    <w:rPr>
-                      <w:rFonts w:ascii="Arial" w:hAnsi="Arial"/>
-                      <w:b/>
-                      <w:i w:val="0"/>
-                      <w:color w:val="222222"/>
-                      <w:sz w:val="19"/>
-                    </w:rPr>
-                    <w:t>Product Manager - Startup SaaS B2B/B2C</w:t>
-                  </w:r>
-                </w:p>
-                <w:p>
-                  <w:pPr>
-                    <w:spacing w:after="60" w:line="276" w:lineRule="auto"/>
-                    <w:ind w:left="200"/>
-                  </w:pPr>
-                  <w:r>
-                    <w:rPr>
-                      <w:rFonts w:ascii="Arial" w:hAnsi="Arial"/>
-                      <w:color w:val="333333"/>
-                      <w:sz w:val="17"/>
-                    </w:rPr>
-                    <w:t xml:space="preserve">• </w:t>
-                  </w:r>
-                  <w:r>
-                    <w:rPr>
-                      <w:rFonts w:ascii="Arial" w:hAnsi="Arial"/>
-                      <w:color w:val="333333"/>
-                      <w:sz w:val="17"/>
-                    </w:rPr>
-                    <w:t>Plateforme de trading B2B/B2C : gestion de comptes traders (B2B, démonstrations, onboarding sur la marketplace) et de clients qui copiaient leurs trades (B2C), support utilisateur, animation communauté (Telegram, newsletter), publicité Facebook</w:t>
-                  </w:r>
-                </w:p>
-                <w:p>
-                  <w:pPr>
-                    <w:spacing w:after="60" w:line="276" w:lineRule="auto"/>
-                    <w:ind w:left="200"/>
-                  </w:pPr>
-                  <w:r>
-                    <w:rPr>
-                      <w:rFonts w:ascii="Arial" w:hAnsi="Arial"/>
-                      <w:color w:val="333333"/>
-                      <w:sz w:val="17"/>
-                    </w:rPr>
-                    <w:t xml:space="preserve">• </w:t>
-                  </w:r>
-                  <w:r>
-                    <w:rPr>
-                      <w:rFonts w:ascii="Arial" w:hAnsi="Arial"/>
-                      <w:color w:val="333333"/>
-                      <w:sz w:val="17"/>
-                    </w:rPr>
-                    <w:t>Suivi des KPI d'adoption et de rétention ; évolutions du produit pour répondre aux besoins spécifiques de chaque compte</w:t>
-                  </w:r>
-                </w:p>
-                <w:p>
-                  <w:pPr>
-                    <w:spacing w:after="60" w:line="276" w:lineRule="auto"/>
-                    <w:ind w:left="200"/>
-                  </w:pPr>
-                  <w:r>
-                    <w:rPr>
-                      <w:rFonts w:ascii="Arial" w:hAnsi="Arial"/>
-                      <w:color w:val="333333"/>
-                      <w:sz w:val="17"/>
-                    </w:rPr>
-                    <w:t xml:space="preserve">• </w:t>
-                  </w:r>
-                  <w:r>
-                    <w:rPr>
-                      <w:rFonts w:ascii="Arial" w:hAnsi="Arial"/>
-                      <w:color w:val="333333"/>
-                      <w:sz w:val="17"/>
-                    </w:rPr>
-                    <w:t>SEO : rédaction blog, cocons sémantiques ; gestion de stagiaires et d'alternants ; recette des nouvelles fonctionnalités</w:t>
-                  </w:r>
-                </w:p>
-              </w:tc>
-            </w:tr>
-          </w:tbl>
           <w:p/>
           <w:p>
             <w:pPr>

</xml_diff>